<commit_message>
Add settings and time saved screenshots to illustrated overview
Co-Authored-By: Claude Opus 5.5 (1M context) <noreply@anthropic.com>
Claude-Session: https://claude.ai/code/session_01KDMyrk7oWH5NcBVCvciDK9
</commit_message>
<xml_diff>
--- a/docs/Watchlog - Overview (with screenshots).docx
+++ b/docs/Watchlog - Overview (with screenshots).docx
@@ -1665,6 +1665,60 @@
     </w:p>
     <w:p>
       <w:pPr>
+        <w:keepNext/>
+        <w:jc w:val="center"/>
+      </w:pPr>
+      <w:r>
+        <w:drawing>
+          <wp:inline>
+            <wp:extent cx="3291840" cy="3250692"/>
+            <wp:docPr id="15" name="Picture 15"/>
+            <wp:cNvGraphicFramePr>
+              <a:graphicFrameLocks noChangeAspect="1"/>
+            </wp:cNvGraphicFramePr>
+            <a:graphic>
+              <a:graphicData uri="http://schemas.openxmlformats.org/drawingml/2006/picture">
+                <pic:pic>
+                  <pic:nvPicPr>
+                    <pic:cNvPr id="0" name="14 settings.png"/>
+                    <pic:cNvPicPr/>
+                  </pic:nvPicPr>
+                  <pic:blipFill>
+                    <a:blip r:embed="rId17"/>
+                    <a:stretch>
+                      <a:fillRect/>
+                    </a:stretch>
+                  </pic:blipFill>
+                  <pic:spPr>
+                    <a:xfrm>
+                      <a:off x="0" y="0"/>
+                      <a:ext cx="3291840" cy="3250692"/>
+                    </a:xfrm>
+                    <a:prstGeom prst="rect"/>
+                  </pic:spPr>
+                </pic:pic>
+              </a:graphicData>
+            </a:graphic>
+          </wp:inline>
+        </w:drawing>
+      </w:r>
+    </w:p>
+    <w:p>
+      <w:pPr>
+        <w:spacing w:after="200"/>
+        <w:jc w:val="center"/>
+      </w:pPr>
+      <w:r>
+        <w:rPr>
+          <w:i/>
+          <w:color w:val="555555"/>
+          <w:sz w:val="18"/>
+        </w:rPr>
+        <w:t>The Settings window, where logins, the team templates file and the journal are set up. I covered the usernames.</w:t>
+      </w:r>
+    </w:p>
+    <w:p>
+      <w:pPr>
         <w:pStyle w:val="Heading2"/>
       </w:pPr>
       <w:r>
@@ -2534,6 +2588,60 @@
       <w:pPr/>
       <w:r>
         <w:t xml:space="preserve">Since version 3.2.0 the tool keeps its own count, so these estimates can be replaced with real numbers. For each entry it works out how much went in compared with how much I typed. An empty box counts as nothing saved, so the numbers aren't inflated. Logins and time stamps are counted too, and the time comes from 40 words a minute. Tray menu &gt; Time saved shows logs, logins, keystrokes and time saved for this shift, today, the last 7 days, the last 30 days and the total, and Copy report puts it on the clipboard. It only stores numbers, never the text of a log.</w:t>
+      </w:r>
+    </w:p>
+    <w:p>
+      <w:pPr>
+        <w:keepNext/>
+        <w:jc w:val="center"/>
+      </w:pPr>
+      <w:r>
+        <w:drawing>
+          <wp:inline>
+            <wp:extent cx="3840480" cy="696796"/>
+            <wp:docPr id="16" name="Picture 16"/>
+            <wp:cNvGraphicFramePr>
+              <a:graphicFrameLocks noChangeAspect="1"/>
+            </wp:cNvGraphicFramePr>
+            <a:graphic>
+              <a:graphicData uri="http://schemas.openxmlformats.org/drawingml/2006/picture">
+                <pic:pic>
+                  <pic:nvPicPr>
+                    <pic:cNvPr id="0" name="17 time saved.png"/>
+                    <pic:cNvPicPr/>
+                  </pic:nvPicPr>
+                  <pic:blipFill>
+                    <a:blip r:embed="rId18"/>
+                    <a:stretch>
+                      <a:fillRect/>
+                    </a:stretch>
+                  </pic:blipFill>
+                  <pic:spPr>
+                    <a:xfrm>
+                      <a:off x="0" y="0"/>
+                      <a:ext cx="3840480" cy="696796"/>
+                    </a:xfrm>
+                    <a:prstGeom prst="rect"/>
+                  </pic:spPr>
+                </pic:pic>
+              </a:graphicData>
+            </a:graphic>
+          </wp:inline>
+        </w:drawing>
+      </w:r>
+    </w:p>
+    <w:p>
+      <w:pPr>
+        <w:spacing w:after="200"/>
+        <w:jc w:val="center"/>
+      </w:pPr>
+      <w:r>
+        <w:rPr>
+          <w:i/>
+          <w:color w:val="555555"/>
+          <w:sz w:val="18"/>
+        </w:rPr>
+        <w:t>The time saved so far this shift, shown at the top of the shift journal. Tray menu &gt; Time saved has the full breakdown.</w:t>
       </w:r>
     </w:p>
     <w:p>

</xml_diff>

<commit_message>
Overview: Citrix line back, v3.4.0
Co-Authored-By: Claude Opus 5.5 (1M context) <noreply@anthropic.com>
Claude-Session: https://claude.ai/code/session_01KDMyrk7oWH5NcBVCvciDK9
</commit_message>
<xml_diff>
--- a/docs/Watchlog - Overview (with screenshots).docx
+++ b/docs/Watchlog - Overview (with screenshots).docx
@@ -321,7 +321,7 @@
     <w:p>
       <w:pPr/>
       <w:r>
-        <w:t xml:space="preserve">It's a small Windows program written in AutoHotkey, a free automation tool that has been around for years. It sits by the clock as a small teal icon and can start with Windows. I've been building and testing it myself since October 13. Version 3.0 was the first one set up for the team, and it's on 3.3.0 now.</w:t>
+        <w:t>It's a small Windows program written in AutoHotkey, a free automation tool that has been around for years. It sits by the clock as a small teal icon and can start with Windows. I've been building and testing it myself since October 13. Version 3.0 was the first one set up for the team, and it's on 3.4.0 now.</w:t>
       </w:r>
     </w:p>
     <w:p>
@@ -1427,7 +1427,7 @@
         </w:numPr>
       </w:pPr>
       <w:r>
-        <w:t xml:space="preserve">Ctrl+Alt+L opens everything for the start of shift in a few seconds: the work websites, iTrak facial recognition in Edge, AlertGrid, SDS and CMP, skipping anything that's already open. Ctrl+Alt+Shift+L closes it all at the end of the shift, after confirming. It logs out of SDS properly first instead of just closing it, and Ctrl+Alt+K does that SDS logout on its own.</w:t>
+        <w:t>Ctrl+Alt+L opens everything for the start of shift in about 20 seconds: SDS, AlertGrid and CMP first, then the work websites and iTrak facial recognition in Edge, skipping anything that's already open, and ends with Chrome on the Citrix page ready to start iTrak. Ctrl+Alt+Shift+L closes it all at the end of the shift, after confirming. It logs out of SDS properly first instead of just closing it, and Ctrl+Alt+K does that SDS logout on its own.</w:t>
       </w:r>
     </w:p>
     <w:p>
@@ -3485,7 +3485,7 @@
     <w:p>
       <w:pPr/>
       <w:r>
-        <w:t xml:space="preserve">Version 3.3.0 is built and I've been testing it myself since October 13. If it's approved, this is how I'd see it going:</w:t>
+        <w:t>Version 3.4.0 is built and I've been testing it myself since October 13. If it's approved, this is how I'd see it going:</w:t>
       </w:r>
     </w:p>
     <w:p>

</xml_diff>

<commit_message>
End-of-day review: example settings, README, overviews, demo sheet
- settings.example.ini: example login ;me clashed with ;medical (now ;login);
  LaunchWait example 20 to match the at-least-20 note
- README: suffix= in the box options list
- Overviews (plain and illustrated): v3.4.1
- Demo run sheet: exact outputs from a test run, Time saved note
- Pending changes / Next Steps: brought up to v3.4.1

Co-Authored-By: Claude Opus 5.5 <noreply@anthropic.com>
Claude-Session: https://claude.ai/code/session_01KDMyrk7oWH5NcBVCvciDK9
</commit_message>
<xml_diff>
--- a/docs/Watchlog - Overview (with screenshots).docx
+++ b/docs/Watchlog - Overview (with screenshots).docx
@@ -321,7 +321,7 @@
     <w:p>
       <w:pPr/>
       <w:r>
-        <w:t>It's a small Windows program written in AutoHotkey, a free automation tool that has been around for years. It sits by the clock as a small teal icon and can start with Windows. I've been building and testing it myself since October 13. Version 3.0 was the first one set up for the team, and it's on 3.4.0 now.</w:t>
+        <w:t>It's a small Windows program written in AutoHotkey, a free automation tool that has been around for years. It sits by the clock as a small teal icon and can start with Windows. I've been building and testing it myself since October 13. Version 3.0 was the first one set up for the team, and it's on 3.4.1 now.</w:t>
       </w:r>
     </w:p>
     <w:p>
@@ -3476,7 +3476,7 @@
     <w:p>
       <w:pPr/>
       <w:r>
-        <w:t>Version 3.4.0 is built and I've been testing it myself since October 13. If it's approved, this is how I'd see it going:</w:t>
+        <w:t>Version 3.4.1 is built and I've been testing it myself since October 13. If it's approved, this is how I'd see it going:</w:t>
       </w:r>
     </w:p>
     <w:p>

</xml_diff>

<commit_message>
v3.4.2: ;audit Location caps, safe window-title reads
Co-Authored-By: Claude Sonnet 5.5 <noreply@anthropic.com>
Claude-Session: https://claude.ai/code/session_01KDMyrk7oWH5NcBVCvciDK9
</commit_message>
<xml_diff>
--- a/docs/Watchlog - Overview (with screenshots).docx
+++ b/docs/Watchlog - Overview (with screenshots).docx
@@ -321,7 +321,7 @@
     <w:p>
       <w:pPr/>
       <w:r>
-        <w:t>It's a small Windows program written in AutoHotkey, a free automation tool that has been around for years. It sits by the clock as a small teal icon and can start with Windows. I've been building and testing it myself since October 13. Version 3.0 was the first one set up for the team, and it's on 3.4.1 now.</w:t>
+        <w:t>It's a small Windows program written in AutoHotkey, a free automation tool that has been around for years. It sits by the clock as a small teal icon and can start with Windows. I've been building and testing it myself since October 13. Version 3.0 was the first one set up for the team, and it's on 3.4.2 now.</w:t>
       </w:r>
     </w:p>
     <w:p>
@@ -3476,7 +3476,7 @@
     <w:p>
       <w:pPr/>
       <w:r>
-        <w:t>Version 3.4.1 is built and I've been testing it myself since October 13. If it's approved, this is how I'd see it going:</w:t>
+        <w:t>Version 3.4.2 is built and I've been testing it myself since October 13. If it's approved, this is how I'd see it going:</w:t>
       </w:r>
     </w:p>
     <w:p>

</xml_diff>

<commit_message>
Docs for v3.4.3: overviews, wording review (one ;refuse row, contractor pass)
Co-Authored-By: Claude Sonnet 5.5 <noreply@anthropic.com>
Claude-Session: https://claude.ai/code/session_01JwPpfkmEBpRJfEitpewgHU
</commit_message>
<xml_diff>
--- a/docs/Watchlog - Overview (with screenshots).docx
+++ b/docs/Watchlog - Overview (with screenshots).docx
@@ -321,7 +321,7 @@
     <w:p>
       <w:pPr/>
       <w:r>
-        <w:t>It's a small Windows program written in AutoHotkey, a free automation tool that has been around for years. It sits by the clock as a small teal icon and can start with Windows. I've been building and testing it myself since October 13. Version 3.0 was the first one set up for the team, and it's on 3.4.2 now.</w:t>
+        <w:t>It's a small Windows program written in AutoHotkey, a free automation tool that has been around for years. It sits by the clock as a small teal icon and can start with Windows. I've been building and testing it myself since October 13. Version 3.0 was the first one set up for the team, and it's on 3.4.3 now.</w:t>
       </w:r>
     </w:p>
     <w:p>
@@ -886,7 +886,7 @@
               <w:t xml:space="preserve">;badge</w:t>
             </w:r>
             <w:r>
-              <w:t xml:space="preserve"> visitor badge</w:t>
+              <w:t xml:space="preserve"> contractor pass or interview pass</w:t>
             </w:r>
           </w:p>
         </w:tc>
@@ -3077,7 +3077,7 @@
         </w:numPr>
       </w:pPr>
       <w:r>
-        <w:t xml:space="preserve">It only types a password when that login's code is typed, and a login can be locked to one program.</w:t>
+        <w:t>It only types a password when that login's code is typed, and each login can be locked to the programs it belongs to, so it types nothing anywhere else.</w:t>
       </w:r>
     </w:p>
     <w:p>
@@ -3476,7 +3476,7 @@
     <w:p>
       <w:pPr/>
       <w:r>
-        <w:t>Version 3.4.2 is built and I've been testing it myself since October 13. If it's approved, this is how I'd see it going:</w:t>
+        <w:t>Version 3.4.3 is built and I've been testing it myself since October 13. If it's approved, this is how I'd see it going:</w:t>
       </w:r>
     </w:p>
     <w:p>

</xml_diff>

<commit_message>
Watchlog v3.5.0: exe with one-step install, first-run tutorial, exe self-update
Co-Authored-By: Claude Sonnet 5.5 <noreply@anthropic.com>
Claude-Session: https://claude.ai/code/session_01JwPpfkmEBpRJfEitpewgHU
</commit_message>
<xml_diff>
--- a/docs/Watchlog - Overview (with screenshots).docx
+++ b/docs/Watchlog - Overview (with screenshots).docx
@@ -321,7 +321,7 @@
     <w:p>
       <w:pPr/>
       <w:r>
-        <w:t>It's a small Windows program written in AutoHotkey, a free automation tool that has been around for years. It sits by the clock as a small teal icon and can start with Windows. I've been building and testing it myself since October 13. Version 3.0 was the first one set up for the team, and it's on 3.4.3 now.</w:t>
+        <w:t>It's a small Windows program written in AutoHotkey, a free automation tool that has been around for years. It sits by the clock as a small teal icon and can start with Windows. I've been building and testing it myself since October 13. Version 3.0 was the first one set up for the team, and it's on 3.4.2 now.</w:t>
       </w:r>
     </w:p>
     <w:p>
@@ -886,7 +886,7 @@
               <w:t xml:space="preserve">;badge</w:t>
             </w:r>
             <w:r>
-              <w:t xml:space="preserve"> contractor pass or interview pass</w:t>
+              <w:t xml:space="preserve"> visitor badge</w:t>
             </w:r>
           </w:p>
         </w:tc>
@@ -3077,7 +3077,7 @@
         </w:numPr>
       </w:pPr>
       <w:r>
-        <w:t>It only types a password when that login's code is typed, and each login can be locked to the programs it belongs to, so it types nothing anywhere else.</w:t>
+        <w:t xml:space="preserve">It only types a password when that login's code is typed, and a login can be locked to one program.</w:t>
       </w:r>
     </w:p>
     <w:p>
@@ -3476,7 +3476,7 @@
     <w:p>
       <w:pPr/>
       <w:r>
-        <w:t>Version 3.4.3 is built and I've been testing it myself since October 13. If it's approved, this is how I'd see it going:</w:t>
+        <w:t>Version 3.4.2 is built and I've been testing it myself since October 13. If it's approved, this is how I'd see it going:</w:t>
       </w:r>
     </w:p>
     <w:p>

</xml_diff>

<commit_message>
Keep the v3.4.3 docs updates (restore overviews and wording review)
Co-Authored-By: Claude Sonnet 5.5 <noreply@anthropic.com>
Claude-Session: https://claude.ai/code/session_01JwPpfkmEBpRJfEitpewgHU
</commit_message>
<xml_diff>
--- a/docs/Watchlog - Overview (with screenshots).docx
+++ b/docs/Watchlog - Overview (with screenshots).docx
@@ -321,7 +321,7 @@
     <w:p>
       <w:pPr/>
       <w:r>
-        <w:t>It's a small Windows program written in AutoHotkey, a free automation tool that has been around for years. It sits by the clock as a small teal icon and can start with Windows. I've been building and testing it myself since October 13. Version 3.0 was the first one set up for the team, and it's on 3.4.2 now.</w:t>
+        <w:t>It's a small Windows program written in AutoHotkey, a free automation tool that has been around for years. It sits by the clock as a small teal icon and can start with Windows. I've been building and testing it myself since October 13. Version 3.0 was the first one set up for the team, and it's on 3.4.3 now.</w:t>
       </w:r>
     </w:p>
     <w:p>
@@ -886,7 +886,7 @@
               <w:t xml:space="preserve">;badge</w:t>
             </w:r>
             <w:r>
-              <w:t xml:space="preserve"> visitor badge</w:t>
+              <w:t xml:space="preserve"> contractor pass or interview pass</w:t>
             </w:r>
           </w:p>
         </w:tc>
@@ -3077,7 +3077,7 @@
         </w:numPr>
       </w:pPr>
       <w:r>
-        <w:t xml:space="preserve">It only types a password when that login's code is typed, and a login can be locked to one program.</w:t>
+        <w:t>It only types a password when that login's code is typed, and each login can be locked to the programs it belongs to, so it types nothing anywhere else.</w:t>
       </w:r>
     </w:p>
     <w:p>
@@ -3476,7 +3476,7 @@
     <w:p>
       <w:pPr/>
       <w:r>
-        <w:t>Version 3.4.2 is built and I've been testing it myself since October 13. If it's approved, this is how I'd see it going:</w:t>
+        <w:t>Version 3.4.3 is built and I've been testing it myself since October 13. If it's approved, this is how I'd see it going:</w:t>
       </w:r>
     </w:p>
     <w:p>

</xml_diff>

<commit_message>
v3.24.0: code words that fill the whole iTrak daily log
A templates.txt line can end with  >> Location | Topic | Reference [| end].
Typing the code word fills the open daily log or opens a new one; Shift+Enter
on the form pastes just the wording. Docs, templates, hand-off synced to 3.24.0.
Not run: AutoHotkey could not be run in the sandbox.

Co-Authored-By: Claude Opus 5.5 <noreply@anthropic.com>
Claude-Session: https://claude.ai/code/session_01WkiUyhHHodp8YwtfXPPPBP
</commit_message>
<xml_diff>
--- a/docs/Watchlog - Overview (with screenshots).docx
+++ b/docs/Watchlog - Overview (with screenshots).docx
@@ -363,7 +363,7 @@
         <w:pStyle w:val="FirstParagraph"/>
       </w:pPr>
       <w:r>
-        <w:t xml:space="preserve">It’s a small Windows program. It’s written in AutoHotkey, a free automation tool that has been around for years, and comes as a single Watchlog.exe with everything built in, so nothing else needs installing. It sits by the clock as a small teal icon and starts with Windows. I’ve been building and testing it myself since October 13. Version 3.0 was the first one set up for the team, and it’s on 3.10.1 now.</w:t>
+        <w:t xml:space="preserve">It’s a small Windows program. It’s written in AutoHotkey, a free automation tool that has been around for years, and comes as a single Watchlog.exe with everything built in, so nothing else needs installing. It sits by the clock as a small teal icon and starts with Windows. I’ve been building and testing it myself since October 13. Version 3.0 was the first one set up for the team, and it’s on 3.23.0 now.</w:t>
       </w:r>
     </w:p>
     <w:p>
@@ -1860,7 +1860,7 @@
         <w:pStyle w:val="Compact"/>
       </w:pPr>
       <w:r>
-        <w:t xml:space="preserve">Ctrl+Alt+L opens everything for the start of shift in about 20 seconds: SDS, Alert Grid and CMP first, then the work websites and iTrak facial recognition in Edge, skipping anything that’s already open. It offers the sign-in above, puts the windows back where I like them, and ends with Chrome on the Citrix page ready to start iTrak.</w:t>
+        <w:t xml:space="preserve">Ctrl+Alt+L opens everything for the start of shift in about 20 seconds: SDS, Alert Grid and CMP first, then the iTrak facial recognition and the Citrix page in Edge, skipping anything that’s already open. It offers the sign-in above, puts the windows back where I like them, and ends with Edge on the Citrix page ready to start iTrak.</w:t>
       </w:r>
     </w:p>
     <w:p>
@@ -1908,7 +1908,7 @@
         <w:pStyle w:val="Compact"/>
       </w:pPr>
       <w:r>
-        <w:t xml:space="preserve">Ctrl+Alt and a letter switches to SDS, CMP, Teams, Outlook or Chrome.</w:t>
+        <w:t xml:space="preserve">Ctrl+Alt and a letter switches to SDS, CMP, Teams, Outlook or Edge.</w:t>
       </w:r>
     </w:p>
     <w:p>
@@ -4514,7 +4514,7 @@
         <w:pStyle w:val="FirstParagraph"/>
       </w:pPr>
       <w:r>
-        <w:t xml:space="preserve">Version 3.10.1 is built and I’ve been using it on my own shifts. If it’s approved, this is how I’d see it going:</w:t>
+        <w:t xml:space="preserve">Version 3.24.0 is built and I’ve been using it on my own shifts. If it’s approved, this is how I’d see it going:</w:t>
       </w:r>
     </w:p>
     <w:p>

</xml_diff>

<commit_message>
v3.29.2: ;cards uses the table's pit; templates fall back to a backup when cut short
Co-Authored-By: Claude Opus 5.5 <noreply@anthropic.com>
Claude-Session: https://claude.ai/code/session_01WkiUyhHHodp8YwtfXPPPBP
</commit_message>
<xml_diff>
--- a/docs/Watchlog - Overview (with screenshots).docx
+++ b/docs/Watchlog - Overview (with screenshots).docx
@@ -363,7 +363,7 @@
         <w:pStyle w:val="FirstParagraph"/>
       </w:pPr>
       <w:r>
-        <w:t xml:space="preserve">It’s a small Windows program. It’s written in AutoHotkey, a free automation tool that has been around for years, and comes as a single Watchlog.exe with everything built in, so nothing else needs installing. It sits by the clock as a small teal icon and starts with Windows. I’ve been building and testing it myself since October 13. Version 3.0 was the first one set up for the team, and it’s on 3.29.1 now.</w:t>
+        <w:t xml:space="preserve">It’s a small Windows program. It’s written in AutoHotkey, a free automation tool that has been around for years, and comes as a single Watchlog.exe with everything built in, so nothing else needs installing. It sits by the clock as a small teal icon and starts with Windows. I’ve been building and testing it myself since October 13. Version 3.0 was the first one set up for the team, and it’s on 3.29.2 now.</w:t>
       </w:r>
     </w:p>
     <w:p>
@@ -4783,7 +4783,7 @@
         <w:pStyle w:val="FirstParagraph"/>
       </w:pPr>
       <w:r>
-        <w:t xml:space="preserve">Version 3.29.1 is built and I’ve been using it on my own shifts. If it’s approved, this is how I’d see it going:</w:t>
+        <w:t xml:space="preserve">Version 3.29.2 is built and I’ve been using it on my own shifts. If it’s approved, this is how I’d see it going:</w:t>
       </w:r>
     </w:p>
     <w:p>

</xml_diff>